<commit_message>
docs: correct architecture and exception claims, rebuild report, slides and zip
Co-Authored-By: Claude Opus 5.5 <noreply@anthropic.com>
</commit_message>
<xml_diff>
--- a/deliverables/Project_Report.docx
+++ b/deliverables/Project_Report.docx
@@ -472,7 +472,7 @@
       <w:r>
         <w:drawing>
           <wp:inline xmlns:a="http://schemas.openxmlformats.org/drawingml/2006/main" xmlns:pic="http://schemas.openxmlformats.org/drawingml/2006/picture">
-            <wp:extent cx="3108960" cy="3722349"/>
+            <wp:extent cx="4937760" cy="3352025"/>
             <wp:docPr id="1" name="Picture 1"/>
             <wp:cNvGraphicFramePr>
               <a:graphicFrameLocks noChangeAspect="1"/>
@@ -481,7 +481,7 @@
               <a:graphicData uri="http://schemas.openxmlformats.org/drawingml/2006/picture">
                 <pic:pic>
                   <pic:nvPicPr>
-                    <pic:cNvPr id="0" name="cli_session.png"/>
+                    <pic:cNvPr id="0" name="gui_summary.png"/>
                     <pic:cNvPicPr/>
                   </pic:nvPicPr>
                   <pic:blipFill>
@@ -493,7 +493,7 @@
                   <pic:spPr>
                     <a:xfrm>
                       <a:off x="0" y="0"/>
-                      <a:ext cx="3108960" cy="3722349"/>
+                      <a:ext cx="4937760" cy="3352025"/>
                     </a:xfrm>
                     <a:prstGeom prst="rect"/>
                   </pic:spPr>
@@ -514,7 +514,7 @@
           <w:color w:val="616161"/>
           <w:sz w:val="18"/>
         </w:rPr>
-        <w:t>Figure 1 — CLI mode: an invalid amount is re-prompted, then a budget alert is raised.</w:t>
+        <w:t>Figure 1 — Tkinter GUI, Summary tab: KPIs, monthly table and colour-coded alerts.</w:t>
       </w:r>
     </w:p>
     <w:p>
@@ -525,7 +525,7 @@
       <w:r>
         <w:drawing>
           <wp:inline xmlns:a="http://schemas.openxmlformats.org/drawingml/2006/main" xmlns:pic="http://schemas.openxmlformats.org/drawingml/2006/picture">
-            <wp:extent cx="5120640" cy="3476174"/>
+            <wp:extent cx="5120640" cy="3911600"/>
             <wp:docPr id="2" name="Picture 2"/>
             <wp:cNvGraphicFramePr>
               <a:graphicFrameLocks noChangeAspect="1"/>
@@ -534,7 +534,7 @@
               <a:graphicData uri="http://schemas.openxmlformats.org/drawingml/2006/picture">
                 <pic:pic>
                   <pic:nvPicPr>
-                    <pic:cNvPr id="0" name="gui_summary.png"/>
+                    <pic:cNvPr id="0" name="dashboard_overview.png"/>
                     <pic:cNvPicPr/>
                   </pic:nvPicPr>
                   <pic:blipFill>
@@ -546,7 +546,7 @@
                   <pic:spPr>
                     <a:xfrm>
                       <a:off x="0" y="0"/>
-                      <a:ext cx="5120640" cy="3476174"/>
+                      <a:ext cx="5120640" cy="3911600"/>
                     </a:xfrm>
                     <a:prstGeom prst="rect"/>
                   </pic:spPr>
@@ -567,7 +567,7 @@
           <w:color w:val="616161"/>
           <w:sz w:val="18"/>
         </w:rPr>
-        <w:t>Figure 2 — Tkinter GUI, Summary tab: KPIs, monthly table and colour-coded alerts.</w:t>
+        <w:t>Figure 2 — Streamlit dashboard (captured with Playwright): filters, KPIs, Plotly charts.</w:t>
       </w:r>
     </w:p>
     <w:p>
@@ -578,7 +578,7 @@
       <w:r>
         <w:drawing>
           <wp:inline xmlns:a="http://schemas.openxmlformats.org/drawingml/2006/main" xmlns:pic="http://schemas.openxmlformats.org/drawingml/2006/picture">
-            <wp:extent cx="5486400" cy="4191000"/>
+            <wp:extent cx="3749039" cy="4488714"/>
             <wp:docPr id="3" name="Picture 3"/>
             <wp:cNvGraphicFramePr>
               <a:graphicFrameLocks noChangeAspect="1"/>
@@ -587,7 +587,7 @@
               <a:graphicData uri="http://schemas.openxmlformats.org/drawingml/2006/picture">
                 <pic:pic>
                   <pic:nvPicPr>
-                    <pic:cNvPr id="0" name="dashboard_overview.png"/>
+                    <pic:cNvPr id="0" name="cli_session.png"/>
                     <pic:cNvPicPr/>
                   </pic:nvPicPr>
                   <pic:blipFill>
@@ -599,7 +599,7 @@
                   <pic:spPr>
                     <a:xfrm>
                       <a:off x="0" y="0"/>
-                      <a:ext cx="5486400" cy="4191000"/>
+                      <a:ext cx="3749039" cy="4488714"/>
                     </a:xfrm>
                     <a:prstGeom prst="rect"/>
                   </pic:spPr>
@@ -620,7 +620,7 @@
           <w:color w:val="616161"/>
           <w:sz w:val="18"/>
         </w:rPr>
-        <w:t>Figure 3 — Streamlit dashboard (captured with Playwright): filters, KPIs, Plotly charts.</w:t>
+        <w:t>Figure 3 — CLI mode (rendered console output): an invalid amount is re-prompted, then a budget alert is raised.</w:t>
       </w:r>
     </w:p>
     <w:p>
@@ -670,6 +670,9 @@
         <w:gridCol w:w="3120"/>
       </w:tblGrid>
       <w:tr>
+        <w:trPr>
+          <w:tblHeader w:val="true"/>
+        </w:trPr>
         <w:tc>
           <w:tcPr>
             <w:tcW w:type="dxa" w:w="1872"/>
@@ -1320,7 +1323,46 @@
                 <w:rFonts w:ascii="Consolas" w:hAnsi="Consolas"/>
                 <w:sz w:val="18"/>
               </w:rPr>
-              <w:t>try/except/else/finally</w:t>
+              <w:t>try/except/else</w:t>
+            </w:r>
+            <w:r>
+              <w:rPr>
+                <w:sz w:val="18"/>
+              </w:rPr>
+              <w:t xml:space="preserve"> in </w:t>
+            </w:r>
+            <w:r>
+              <w:rPr>
+                <w:rFonts w:ascii="Consolas" w:hAnsi="Consolas"/>
+                <w:sz w:val="18"/>
+              </w:rPr>
+              <w:t>load_json</w:t>
+            </w:r>
+            <w:r>
+              <w:rPr>
+                <w:sz w:val="18"/>
+              </w:rPr>
+              <w:t xml:space="preserve">, </w:t>
+            </w:r>
+            <w:r>
+              <w:rPr>
+                <w:rFonts w:ascii="Consolas" w:hAnsi="Consolas"/>
+                <w:sz w:val="18"/>
+              </w:rPr>
+              <w:t>try/except/finally</w:t>
+            </w:r>
+            <w:r>
+              <w:rPr>
+                <w:sz w:val="18"/>
+              </w:rPr>
+              <w:t xml:space="preserve"> in </w:t>
+            </w:r>
+            <w:r>
+              <w:rPr>
+                <w:rFonts w:ascii="Consolas" w:hAnsi="Consolas"/>
+                <w:sz w:val="18"/>
+              </w:rPr>
+              <w:t>_atomic_write</w:t>
             </w:r>
             <w:r>
               <w:rPr>
@@ -1825,7 +1867,7 @@
         <w:rPr>
           <w:i w:val="0"/>
         </w:rPr>
-        <w:t xml:space="preserve">The code is organised in layers. The three interfaces never touch files or pandas directly: they call </w:t>
+        <w:t xml:space="preserve">The code is organised in layers. The interfaces contain no business rules: they call </w:t>
       </w:r>
       <w:r>
         <w:rPr>
@@ -1881,7 +1923,7 @@
         <w:rPr>
           <w:i w:val="0"/>
         </w:rPr>
-        <w:t xml:space="preserve"> modules, which rely on validated model objects and on </w:t>
+        <w:t xml:space="preserve"> modules, and only format the results (the dashboard also applies its sidebar filters with pandas). Validation lives in the model classes and every file format lives in </w:t>
       </w:r>
       <w:r>
         <w:rPr>
@@ -1895,7 +1937,7 @@
         <w:rPr>
           <w:i w:val="0"/>
         </w:rPr>
-        <w:t xml:space="preserve"> for all disk access. Because the logic is independent of the interface, the same functions power the CLI, the GUI, the dashboard and the demo — and can be unit tested without a screen.</w:t>
+        <w:t>. Because the logic does not depend on the interface, the same functions power the CLI, the GUI, the dashboard and the demo — and can be unit tested without a screen.</w:t>
       </w:r>
     </w:p>
     <w:p>
@@ -1948,7 +1990,7 @@
           <w:color w:val="616161"/>
           <w:sz w:val="18"/>
         </w:rPr>
-        <w:t>Figure 4 — Layered architecture: each layer only uses the layer below it.</w:t>
+        <w:t>Figure 4 — Layered architecture: interfaces → application logic → domain &amp; persistence → files.</w:t>
       </w:r>
     </w:p>
     <w:p>
@@ -1983,6 +2025,9 @@
         <w:gridCol w:w="4680"/>
       </w:tblGrid>
       <w:tr>
+        <w:trPr>
+          <w:tblHeader w:val="true"/>
+        </w:trPr>
         <w:tc>
           <w:tcPr>
             <w:tcW w:type="dxa" w:w="4896"/>
@@ -2327,20 +2372,33 @@
               <w:rPr>
                 <w:sz w:val="18"/>
               </w:rPr>
-              <w:t xml:space="preserve">Streamlit 1.64 deprecated </w:t>
+              <w:t xml:space="preserve">An independent review found that "0.004" passed the </w:t>
             </w:r>
             <w:r>
               <w:rPr>
                 <w:rFonts w:ascii="Consolas" w:hAnsi="Consolas"/>
                 <w:sz w:val="18"/>
               </w:rPr>
-              <w:t>use_container_width</w:t>
+              <w:t>&gt; 0</w:t>
             </w:r>
             <w:r>
               <w:rPr>
                 <w:sz w:val="18"/>
               </w:rPr>
-              <w:t>, flooding the log with warnings.</w:t>
+              <w:t xml:space="preserve"> check before rounding, creating a $0.00 budget that later crashed with </w:t>
+            </w:r>
+            <w:r>
+              <w:rPr>
+                <w:rFonts w:ascii="Consolas" w:hAnsi="Consolas"/>
+                <w:sz w:val="18"/>
+              </w:rPr>
+              <w:t>ZeroDivisionError</w:t>
+            </w:r>
+            <w:r>
+              <w:rPr>
+                <w:sz w:val="18"/>
+              </w:rPr>
+              <w:t>.</w:t>
             </w:r>
           </w:p>
         </w:tc>
@@ -2355,20 +2413,7 @@
               <w:rPr>
                 <w:sz w:val="18"/>
               </w:rPr>
-              <w:t xml:space="preserve">Switched to the current </w:t>
-            </w:r>
-            <w:r>
-              <w:rPr>
-                <w:rFonts w:ascii="Consolas" w:hAnsi="Consolas"/>
-                <w:sz w:val="18"/>
-              </w:rPr>
-              <w:t>width="stretch"</w:t>
-            </w:r>
-            <w:r>
-              <w:rPr>
-                <w:sz w:val="18"/>
-              </w:rPr>
-              <w:t xml:space="preserve"> API and verified a clean server log.</w:t>
+              <w:t>Round first, then validate (at least 0.01); regression tests for budgets, goals and transactions.</w:t>
             </w:r>
           </w:p>
         </w:tc>
@@ -2481,7 +2526,7 @@
           <w:b/>
           <w:i w:val="0"/>
         </w:rPr>
-        <w:t>100 automated pytest tests</w:t>
+        <w:t>161 automated pytest tests</w:t>
       </w:r>
       <w:r>
         <w:rPr>
@@ -2494,7 +2539,7 @@
           <w:b/>
           <w:i w:val="0"/>
         </w:rPr>
-        <w:t>97 % line coverage</w:t>
+        <w:t>98 % line coverage</w:t>
       </w:r>
       <w:r>
         <w:rPr>
@@ -2528,7 +2573,7 @@
         <w:rPr>
           <w:i w:val="0"/>
         </w:rPr>
-        <w:t xml:space="preserve">. </w:t>
+        <w:t xml:space="preserve">. A standards test checks that every function has a Google-style docstring and type hints and that every course concept is tagged, and </w:t>
       </w:r>
       <w:r>
         <w:rPr>

</xml_diff>

<commit_message>
docs: regenerate report, slides and source zip with name fill-in field
Co-Authored-By: Claude Opus 5.5 <noreply@anthropic.com>
</commit_message>
<xml_diff>
--- a/deliverables/Project_Report.docx
+++ b/deliverables/Project_Report.docx
@@ -102,7 +102,7 @@
           <w:b w:val="0"/>
           <w:sz w:val="24"/>
         </w:rPr>
-        <w:t>[Student Name]</w:t>
+        <w:t>Student Name: ______________________</w:t>
       </w:r>
     </w:p>
     <w:p>
@@ -114,7 +114,7 @@
           <w:b w:val="0"/>
           <w:sz w:val="24"/>
         </w:rPr>
-        <w:t>[Date]</w:t>
+        <w:t>September 30, 2026</w:t>
       </w:r>
     </w:p>
     <w:p>
@@ -191,6 +191,35 @@
           <w:i w:val="0"/>
         </w:rPr>
         <w:t xml:space="preserve"> that runs every feature on a realistic sample dataset (311 fictional transactions over six months).</w:t>
+      </w:r>
+    </w:p>
+    <w:p>
+      <w:r>
+        <w:rPr>
+          <w:b/>
+          <w:i w:val="0"/>
+        </w:rPr>
+        <w:t>Requires Python 3.11+</w:t>
+      </w:r>
+      <w:r>
+        <w:rPr>
+          <w:i w:val="0"/>
+        </w:rPr>
+        <w:t xml:space="preserve"> (pandas 3, matplotlib 3.11). Dependencies are pinned in </w:t>
+      </w:r>
+      <w:r>
+        <w:rPr>
+          <w:rFonts w:ascii="Consolas" w:hAnsi="Consolas"/>
+          <w:i w:val="0"/>
+          <w:sz w:val="19"/>
+        </w:rPr>
+        <w:t>requirements.txt</w:t>
+      </w:r>
+      <w:r>
+        <w:rPr>
+          <w:i w:val="0"/>
+        </w:rPr>
+        <w:t>.</w:t>
       </w:r>
     </w:p>
     <w:p>
@@ -2526,7 +2555,7 @@
           <w:b/>
           <w:i w:val="0"/>
         </w:rPr>
-        <w:t>163 automated pytest tests</w:t>
+        <w:t>173 automated pytest tests</w:t>
       </w:r>
       <w:r>
         <w:rPr>
@@ -2559,7 +2588,35 @@
         <w:rPr>
           <w:i w:val="0"/>
         </w:rPr>
-        <w:t xml:space="preserve"> package (the Tkinter and Streamlit event code is exercised by smoke tests instead). The tests cover normal use, invalid input (bad amounts, dates, kinds, empty names), missing and corrupted files, CSV files with missing columns or bad rows, every pandas calculation on a hand-checked dataset, and full CLI sessions driven by scripted answers. The GUI is built and clicked through on a real display, and the dashboard is rendered headlessly with Streamlit's </w:t>
+        <w:t xml:space="preserve"> package. The coverage scope excludes </w:t>
+      </w:r>
+      <w:r>
+        <w:rPr>
+          <w:rFonts w:ascii="Consolas" w:hAnsi="Consolas"/>
+          <w:i w:val="0"/>
+          <w:sz w:val="19"/>
+        </w:rPr>
+        <w:t>gui_tkinter.py</w:t>
+      </w:r>
+      <w:r>
+        <w:rPr>
+          <w:i w:val="0"/>
+        </w:rPr>
+        <w:t xml:space="preserve"> (Tkinter) and </w:t>
+      </w:r>
+      <w:r>
+        <w:rPr>
+          <w:rFonts w:ascii="Consolas" w:hAnsi="Consolas"/>
+          <w:i w:val="0"/>
+          <w:sz w:val="19"/>
+        </w:rPr>
+        <w:t>dashboard.py</w:t>
+      </w:r>
+      <w:r>
+        <w:rPr>
+          <w:i w:val="0"/>
+        </w:rPr>
+        <w:t xml:space="preserve"> (Streamlit): their event code is exercised by smoke tests instead. The tests cover normal use, invalid input (bad amounts, dates, kinds, empty names), missing and corrupted files, CSV files with missing columns or bad rows, every pandas calculation on a hand-checked dataset, and full CLI sessions driven by scripted answers. The GUI is built and clicked through on a real display, and the dashboard is rendered headlessly with Streamlit's </w:t>
       </w:r>
       <w:r>
         <w:rPr>

</xml_diff>